<commit_message>
Auto-regenerate calendar from spec.md
</commit_message>
<xml_diff>
--- a/2026-2027 Pack 127 Calendar.docx
+++ b/2026-2027 Pack 127 Calendar.docx
@@ -76,7 +76,7 @@
         <w:t xml:space="preserve">1 </w:t>
       </w:r>
       <w:r>
-        <w:t xml:space="preserve">Council Popcorn Kickoff Party — St. Johns River Base, Orange Park (10am–2pm)</w:t>
+        <w:t xml:space="preserve">Council POPCORN Kickoff Party — St. Johns River Base, Orange Park (10am–2pm)</w:t>
       </w:r>
     </w:p>
     <w:p>
@@ -1260,7 +1260,7 @@
         <w:t xml:space="preserve">7 </w:t>
       </w:r>
       <w:r>
-        <w:t xml:space="preserve">2027 Popcorn Kickoff (council) — start of the 2027–28 year</w:t>
+        <w:t xml:space="preserve">2027 POPCORN Kickoff (council) — start of the 2027–28 year</w:t>
       </w:r>
     </w:p>
     <w:p>

</xml_diff>

<commit_message>
Frame spec dates as examples; add Issues list + enforce date correctness
- spec.md: state that all specific dates are examples to re-verify for the
  target year; change the fall campout rule to two weekends before Halloween;
  remove the POPCORN all-caps instruction (demo-video leftover).
- generator: emit a bottom-of-document "Issues — Unverified Dates" list from
  per-event verify notes + buildConfigIssues, and enforce weekday/start-date
  correctness with assertDateLabels (fails the build on any calendar mismatch);
  drop the now-unused capitalizePopcorn pass.
- Reconciled with the remote's new council events (leader training, Camp Card
  kickoff, District Dinner, regatta moved to the Fall Campout).
- Update CLAUDE.md and DATA_SOURCES.md; regenerate the .docx.

Co-Authored-By: Claude Opus 4.8 (1M context) <noreply@anthropic.com>
</commit_message>
<xml_diff>
--- a/2026-2027 Pack 127 Calendar.docx
+++ b/2026-2027 Pack 127 Calendar.docx
@@ -1,5 +1,18 @@
 
-<file path=word/document.xml><?xml version="1.0" encoding="utf-8"?>
+<file path=docProps\app.xml><?xml version="1.0" encoding="utf-8"?>
+<Properties xmlns="http://schemas.openxmlformats.org/officeDocument/2006/extended-properties">
+  <Application>PackCalendar generator</Application>
+</Properties>
+</file>
+
+<file path=docProps\core.xml><?xml version="1.0" encoding="utf-8"?>
+<cp:coreProperties xmlns:cp="http://schemas.openxmlformats.org/package/2006/metadata/core-properties" xmlns:dc="http://purl.org/dc/elements/1.1/">
+  <dc:title>2026-2027 Pack 127 Calendar</dc:title>
+  <dc:creator>Pack 127 Calendar Generator</dc:creator>
+</cp:coreProperties>
+</file>
+
+<file path=word\document.xml><?xml version="1.0" encoding="utf-8"?>
 <w:document xmlns:w="http://schemas.openxmlformats.org/wordprocessingml/2006/main">
   <w:body>
     <w:p>
@@ -76,7 +89,7 @@
         <w:t xml:space="preserve">1 </w:t>
       </w:r>
       <w:r>
-        <w:t xml:space="preserve">Council POPCORN Kickoff Party — St. Johns River Base, Orange Park (10am–2pm)</w:t>
+        <w:t xml:space="preserve">Council Popcorn Kickoff Party — St. Johns River Base, Orange Park (10am–2pm)</w:t>
       </w:r>
     </w:p>
     <w:p>
@@ -368,7 +381,7 @@
         <w:spacing w:after="20"/>
       </w:pPr>
       <w:r>
-        <w:t xml:space="preserve">    Close to home; one night mandatory / two optional (e.g., Troy Springs). Aligns with council Spookoree.</w:t>
+        <w:t xml:space="preserve">    Two weekends before Halloween (Sat Oct 31) so families can do other Halloween activities. Close to home; one night mandatory / two optional (e.g., Troy Springs). Aligns with council Spookoree.</w:t>
       </w:r>
     </w:p>
     <w:p>
@@ -1318,7 +1331,7 @@
         <w:t xml:space="preserve">7 </w:t>
       </w:r>
       <w:r>
-        <w:t xml:space="preserve">2027 POPCORN Kickoff (council) — start of the 2027–28 year</w:t>
+        <w:t xml:space="preserve">2027 Popcorn Kickoff (council) — start of the 2027–28 year</w:t>
       </w:r>
     </w:p>
     <w:p>
@@ -2795,12 +2808,12 @@
         <w:rPr>
           <w:b/>
         </w:rPr>
-        <w:t xml:space="preserve">Notes to verify before publishing</w:t>
-      </w:r>
-    </w:p>
-    <w:p>
-      <w:r>
-        <w:t xml:space="preserve">• Confirm the ACPS 2026-2027 closures against the official calendar — especially whether Veterans Day (Wed, Nov 11, 2026) is a student holiday (assumed OFF here) and the exact January return date.</w:t>
+        <w:t xml:space="preserve">Program notes</w:t>
+      </w:r>
+    </w:p>
+    <w:p>
+      <w:r>
+        <w:t xml:space="preserve">• All date verification is consolidated in the "Issues — Unverified Dates" list at the end of this document.</w:t>
       </w:r>
     </w:p>
     <w:p>
@@ -2810,17 +2823,243 @@
     </w:p>
     <w:p>
       <w:r>
-        <w:t xml:space="preserve">• Parker Sign-Up Night date is still TBD.</w:t>
-      </w:r>
-    </w:p>
-    <w:p>
-      <w:r>
-        <w:t xml:space="preserve">• Council/district dates (Frontier, BALOO, family camps, Pinewood, etc.) are from the Ideal Year of Scouting; confirm at nfcscouting.org/calendar.</w:t>
-      </w:r>
-    </w:p>
-    <w:p>
-      <w:r>
-        <w:t xml:space="preserve">• Back to the Pack (Aug 19) and other August/September details are TBA.</w:t>
+        <w:t xml:space="preserve">• Back to the Pack (the August kickoff) and other August/September details are TBA — confirm before publishing.</w:t>
+      </w:r>
+    </w:p>
+    <w:p>
+      <w:pPr>
+        <w:pStyle w:val="Heading1"/>
+        <w:keepNext/>
+        <w:outlineLvl w:val="0"/>
+        <w:spacing w:before="160" w:after="60"/>
+      </w:pPr>
+      <w:r>
+        <w:rPr>
+          <w:b/>
+        </w:rPr>
+        <w:t xml:space="preserve">Issues — Unverified Dates</w:t>
+      </w:r>
+    </w:p>
+    <w:p>
+      <w:r>
+        <w:t xml:space="preserve">The generator confirms every day-of-week and calendar calculation itself, so the dates on the pages above land on the correct weekdays. What it cannot confirm is whether each externally-scheduled event actually happens on the date shown. Verify each item below against its authoritative source (the ACPS calendar or nfcscouting.org/calendar) before distributing this calendar.</w:t>
+      </w:r>
+    </w:p>
+    <w:p>
+      <w:r>
+        <w:rPr>
+          <w:b/>
+        </w:rPr>
+        <w:t xml:space="preserve">Monday, August 10, 2026 — </w:t>
+      </w:r>
+      <w:r>
+        <w:t xml:space="preserve">ACPS first student day (sets the first Wednesday meeting): Confirm against the official ACPS 2026-2027 calendar.</w:t>
+      </w:r>
+    </w:p>
+    <w:p>
+      <w:r>
+        <w:rPr>
+          <w:b/>
+        </w:rPr>
+        <w:t xml:space="preserve">Saturday, September 19, 2026 — </w:t>
+      </w:r>
+      <w:r>
+        <w:t xml:space="preserve">Frontier Shooting Day (Sat) — Camp Shands: From the Ideal Year of Scouting; confirm against nfcscouting.org/calendar.</w:t>
+      </w:r>
+    </w:p>
+    <w:p>
+      <w:r>
+        <w:rPr>
+          <w:b/>
+        </w:rPr>
+        <w:t xml:space="preserve">Saturday, September 26, 2026 — </w:t>
+      </w:r>
+      <w:r>
+        <w:t xml:space="preserve">Cubmaster &amp; Den Leader Specific Training (Sat) — council: From the Ideal Year of Scouting; confirm at nfcscouting.org/calendar.</w:t>
+      </w:r>
+    </w:p>
+    <w:p>
+      <w:r>
+        <w:rPr>
+          <w:b/>
+        </w:rPr>
+        <w:t xml:space="preserve">Saturday, November 7, 2026 — </w:t>
+      </w:r>
+      <w:r>
+        <w:t xml:space="preserve">BALOO Training — adult leaders (Sat–Sun, Nov 7–8): From the Ideal Year of Scouting; confirm at nfcscouting.org/baloomarion.</w:t>
+      </w:r>
+    </w:p>
+    <w:p>
+      <w:r>
+        <w:rPr>
+          <w:b/>
+        </w:rPr>
+        <w:t xml:space="preserve">Wednesday, November 11, 2026 — </w:t>
+      </w:r>
+      <w:r>
+        <w:t xml:space="preserve">Veterans Day — assumed OFF (no meeting): Confirm whether ACPS closes; if school is open this becomes a regular Wednesday meeting.</w:t>
+      </w:r>
+    </w:p>
+    <w:p>
+      <w:r>
+        <w:rPr>
+          <w:b/>
+        </w:rPr>
+        <w:t xml:space="preserve">Friday, December 11, 2026 — </w:t>
+      </w:r>
+      <w:r>
+        <w:t xml:space="preserve">Cub Winter Wonderland (council) — Dec 11–13: From the Ideal Year of Scouting; confirm at nfcscouting.org/calendar.</w:t>
+      </w:r>
+    </w:p>
+    <w:p>
+      <w:r>
+        <w:rPr>
+          <w:b/>
+        </w:rPr>
+        <w:t xml:space="preserve">Wednesday, January 6, 2027 — </w:t>
+      </w:r>
+      <w:r>
+        <w:t xml:space="preserve">First January meeting after winter break: Confirm the exact ACPS January 2027 return date.</w:t>
+      </w:r>
+    </w:p>
+    <w:p>
+      <w:r>
+        <w:rPr>
+          <w:b/>
+        </w:rPr>
+        <w:t xml:space="preserve">Saturday, January 30, 2027 — </w:t>
+      </w:r>
+      <w:r>
+        <w:t xml:space="preserve">Council Camp Card Sale Kickoff (Sat): From the Ideal Year of Scouting; confirm at nfcscouting.org/calendar.</w:t>
+      </w:r>
+    </w:p>
+    <w:p>
+      <w:r>
+        <w:rPr>
+          <w:b/>
+        </w:rPr>
+        <w:t xml:space="preserve">Friday, February 5, 2027 — </w:t>
+      </w:r>
+      <w:r>
+        <w:t xml:space="preserve">Winter Campout — Medieval Faire Family Camp, Camp Shands (Fri–Sun, Feb 5–7): From the Ideal Year of Scouting; confirm at nfcscouting.org/calendar.</w:t>
+      </w:r>
+    </w:p>
+    <w:p>
+      <w:r>
+        <w:rPr>
+          <w:b/>
+        </w:rPr>
+        <w:t xml:space="preserve">Sunday, February 7, 2027 — </w:t>
+      </w:r>
+      <w:r>
+        <w:t xml:space="preserve">Scout Sunday: Confirm the BSA Scout Sunday date for 2027.</w:t>
+      </w:r>
+    </w:p>
+    <w:p>
+      <w:r>
+        <w:rPr>
+          <w:b/>
+        </w:rPr>
+        <w:t xml:space="preserve">Wednesday, March 3, 2027 — </w:t>
+      </w:r>
+      <w:r>
+        <w:t xml:space="preserve">Five Rivers District Dinner / Banquet (Wed): From the Ideal Year of Scouting; confirm at nfcscouting.org/calendar.</w:t>
+      </w:r>
+    </w:p>
+    <w:p>
+      <w:r>
+        <w:rPr>
+          <w:b/>
+        </w:rPr>
+        <w:t xml:space="preserve">Saturday, April 3, 2027 — </w:t>
+      </w:r>
+      <w:r>
+        <w:t xml:space="preserve">District Pinewood Derby (Sat): Approximate (IYOS ~Apr 3, council ~Apr 17); confirm at nfcscouting.org/calendar.</w:t>
+      </w:r>
+    </w:p>
+    <w:p>
+      <w:r>
+        <w:rPr>
+          <w:b/>
+        </w:rPr>
+        <w:t xml:space="preserve">Friday, April 23, 2027 — </w:t>
+      </w:r>
+      <w:r>
+        <w:t xml:space="preserve">Spring Campout — Family Camp, Camp Shands (Fri–Sun, Apr 23–25): From the Ideal Year of Scouting; confirm at nfcscouting.org/calendar.</w:t>
+      </w:r>
+    </w:p>
+    <w:p>
+      <w:r>
+        <w:rPr>
+          <w:b/>
+        </w:rPr>
+        <w:t xml:space="preserve">Saturday, May 1, 2027 — </w:t>
+      </w:r>
+      <w:r>
+        <w:t xml:space="preserve">Council Volunteer Recognition Awards Dinner: From the Ideal Year of Scouting; confirm at nfcscouting.org/calendar.</w:t>
+      </w:r>
+    </w:p>
+    <w:p>
+      <w:r>
+        <w:rPr>
+          <w:b/>
+        </w:rPr>
+        <w:t xml:space="preserve">Friday, May 28, 2027 — </w:t>
+      </w:r>
+      <w:r>
+        <w:t xml:space="preserve">Last ACPS student day — summer break begins: Confirm the ACPS 2026-2027 last student day.</w:t>
+      </w:r>
+    </w:p>
+    <w:p>
+      <w:r>
+        <w:rPr>
+          <w:b/>
+        </w:rPr>
+        <w:t xml:space="preserve">Friday, May 28, 2027 — </w:t>
+      </w:r>
+      <w:r>
+        <w:t xml:space="preserve">ACPS last student day (ends regular meetings): Confirm against the official ACPS 2026-2027 calendar.</w:t>
+      </w:r>
+    </w:p>
+    <w:p>
+      <w:r>
+        <w:rPr>
+          <w:b/>
+        </w:rPr>
+        <w:t xml:space="preserve">Monday, June 7, 2027 — </w:t>
+      </w:r>
+      <w:r>
+        <w:t xml:space="preserve">Cub Day Camp / Aquatics Camp (council) — week of Jun 7: From the Ideal Year of Scouting; confirm the 2027 camp weeks at nfcscouting.org/calendar.</w:t>
+      </w:r>
+    </w:p>
+    <w:p>
+      <w:r>
+        <w:rPr>
+          <w:b/>
+        </w:rPr>
+        <w:t xml:space="preserve">Saturday, August 7, 2027 — </w:t>
+      </w:r>
+      <w:r>
+        <w:t xml:space="preserve">2027 Popcorn Kickoff (council) — start of the 2027–28 year: Next-year lookahead from the IYOS pattern; confirm the 2027 popcorn kickoff date.</w:t>
+      </w:r>
+    </w:p>
+    <w:p>
+      <w:pPr>
+        <w:pStyle w:val="Heading2"/>
+        <w:keepNext/>
+        <w:outlineLvl w:val="1"/>
+        <w:spacing w:before="160" w:after="60"/>
+      </w:pPr>
+      <w:r>
+        <w:rPr>
+          <w:b/>
+        </w:rPr>
+        <w:t xml:space="preserve">Not yet scheduled (no date set)</w:t>
+      </w:r>
+    </w:p>
+    <w:p>
+      <w:r>
+        <w:t xml:space="preserve">• Parker Sign-Up Night: Date still TBD — confirm with the school, then add it to the calendar.</w:t>
       </w:r>
     </w:p>
     <w:sectPr>
@@ -2834,7 +3073,7 @@
 </w:document>
 </file>
 
-<file path=word/styles.xml><?xml version="1.0" encoding="utf-8"?>
+<file path=word\styles.xml><?xml version="1.0" encoding="utf-8"?>
 <w:styles xmlns:w="http://schemas.openxmlformats.org/wordprocessingml/2006/main">
   <w:docDefaults>
     <w:rPrDefault>

</xml_diff>

<commit_message>
Deterministic .docx writer; fix Monster Bash -> Five Rivers Spookoree
docx.js: replace the platform-specific shell-outs (Windows PowerShell/.NET,
Linux `zip`) with a small pure-Node ZIP writer. Entries are STORED with pinned
1980-01-01 timestamps, forward-slash names, and fixed order, so output is
byte-identical on every platform and Node version. This ends the "Auto-regenerate"
churn where CI and local produced different bytes for identical content.

spec.md: the Oct 23-25 camp the pack skips was mis-named "Monster Bash"; it is the
pack's own district Spookoree (Five Rivers/Marion/Bartram Trail). Renamed and
disambiguated from the St. Johns/Sabol Spookoree (Oct 16-18); flagged its exact
date to confirm (added to the generated Issues list via buildConfigIssues).

Updated CLAUDE.md/README.md/DATA_SOURCES.md packaging notes. Regenerate the .docx.

Co-Authored-By: Claude Opus 4.8 (1M context) <noreply@anthropic.com>
</commit_message>
<xml_diff>
--- a/2026-2027 Pack 127 Calendar.docx
+++ b/2026-2027 Pack 127 Calendar.docx
@@ -368,7 +368,7 @@
         <w:spacing w:after="20"/>
       </w:pPr>
       <w:r>
-        <w:t xml:space="preserve">    Two weekends before Halloween (Sat Oct 31) so families can do other Halloween activities. Close to home; one night mandatory / two optional (e.g., Troy Springs). Aligns with council Spookoree (Oct 16–18).</w:t>
+        <w:t xml:space="preserve">    Two weekends before Halloween (Sat Oct 31) so families can do other Halloween activities. Close to home; one night mandatory / two optional (e.g., Troy Springs). Same weekend as the St. Johns/Sabol Spookoree (Oct 16–18).</w:t>
       </w:r>
     </w:p>
     <w:p>
@@ -2841,6 +2841,17 @@
       </w:r>
       <w:r>
         <w:t xml:space="preserve">Cubmaster &amp; Den Leader Specific Training (Sat) — council: Not found on the council’s live training calendar (Jul 2026); confirm the 2026 date at nfcscouting.org/training.</w:t>
+      </w:r>
+    </w:p>
+    <w:p>
+      <w:r>
+        <w:rPr>
+          <w:b/>
+        </w:rPr>
+        <w:t xml:space="preserve">Friday, October 23, 2026 — </w:t>
+      </w:r>
+      <w:r>
+        <w:t xml:space="preserve">Five Rivers Spookoree family camp (~Oct 23–25) — the pack SKIPS this: Confirm the exact Five Rivers/Marion/Bartram Trail Spookoree dates; the pack skips it (Lubee Bat Festival weekend), so it is not a pack calendar event.</w:t>
       </w:r>
     </w:p>
     <w:p>

</xml_diff>